<commit_message>
Add shared movement parameters to WiFi and migration
</commit_message>
<xml_diff>
--- a/documentation/Window_Control_STM32_Technical_Documentation.docx
+++ b/documentation/Window_Control_STM32_Technical_Documentation.docx
@@ -276,6 +276,12 @@
           <w:t>2.4 Manual Movement Functionality</w:t>
         </w:r>
       </w:hyperlink>
+    </w:p>
+    <w:p>
+      <w:pPr/>
+      <w:r>
+        <w:t>2.4.1 Movement calibration and range parameters</w:t>
+      </w:r>
     </w:p>
     <w:p>
       <w:pPr>
@@ -5046,6 +5052,588 @@
           <w:lang w:val="en-GB"/>
         </w:rPr>
         <w:t>) to the movement task. The movement task copies the target into a queue message so later web changes cannot alter a command already accepted.</w:t>
+      </w:r>
+    </w:p>
+    <w:p>
+      <w:pPr>
+        <w:pStyle w:val="Ttulo3"/>
+      </w:pPr>
+      <w:r>
+        <w:t>2.4.1 Movement calibration and range parameters</w:t>
+      </w:r>
+    </w:p>
+    <w:p>
+      <w:pPr/>
+      <w:r>
+        <w:t>The firmware now separates logical movement targets from motor calibration parameters. The logical X/Z value shown in status remains the requested mechanism position, while the motor-step target can be corrected internally before pulses are generated.</w:t>
+      </w:r>
+    </w:p>
+    <w:p>
+      <w:pPr>
+        <w:pStyle w:val="Prrafodelista"/>
+      </w:pPr>
+      <w:r>
+        <w:t>Core/Inc/movement_parameters.h and Core/Src/movement_parameters.c define the defaults, runtime globals, validation helpers, clamp helpers, and setter functions.</w:t>
+      </w:r>
+    </w:p>
+    <w:p>
+      <w:pPr>
+        <w:pStyle w:val="Prrafodelista"/>
+      </w:pPr>
+      <w:r>
+        <w:t>Horizontal movement parameters apply to the Z axis. Vertical movement parameters apply to the X axis.</w:t>
+      </w:r>
+    </w:p>
+    <w:p>
+      <w:pPr>
+        <w:pStyle w:val="Prrafodelista"/>
+      </w:pPr>
+      <w:r>
+        <w:t>The compensated motor coordinate is calculated as motor_mm = target_mm * (1 + gain) - offset_mm.</w:t>
+      </w:r>
+    </w:p>
+    <w:p>
+      <w:pPr>
+        <w:pStyle w:val="Prrafodelista"/>
+      </w:pPr>
+      <w:r>
+        <w:t>Offset is applied once to the absolute target, not added to each movement; this avoids accumulated drift during automatic tracking.</w:t>
+      </w:r>
+    </w:p>
+    <w:p>
+      <w:pPr>
+        <w:pStyle w:val="Prrafodelista"/>
+      </w:pPr>
+      <w:r>
+        <w:t>X range and Z range define the maximum logical travel accepted by requestMove(), manual commands, external inputs, and automatic-mode validation.</w:t>
+      </w:r>
+    </w:p>
+    <w:tbl>
+      <w:tblPr>
+        <w:tblStyle w:val="Tablaconcuadrcula"/>
+        <w:tblW w:type="auto" w:w="0"/>
+        <w:tblLook w:firstColumn="1" w:firstRow="1" w:lastColumn="0" w:lastRow="0" w:noHBand="0" w:noVBand="1" w:val="04A0"/>
+      </w:tblPr>
+      <w:tblGrid>
+        <w:gridCol w:w="1805"/>
+        <w:gridCol w:w="1805"/>
+        <w:gridCol w:w="1805"/>
+        <w:gridCol w:w="1805"/>
+        <w:gridCol w:w="1805"/>
+      </w:tblGrid>
+      <w:tr>
+        <w:tc>
+          <w:tcPr>
+            <w:tcW w:type="dxa" w:w="1805"/>
+          </w:tcPr>
+          <w:p>
+            <w:r>
+              <w:t>Parameter</w:t>
+            </w:r>
+          </w:p>
+        </w:tc>
+        <w:tc>
+          <w:tcPr>
+            <w:tcW w:type="dxa" w:w="1805"/>
+          </w:tcPr>
+          <w:p>
+            <w:r>
+              <w:t>Runtime variable</w:t>
+            </w:r>
+          </w:p>
+        </w:tc>
+        <w:tc>
+          <w:tcPr>
+            <w:tcW w:type="dxa" w:w="1805"/>
+          </w:tcPr>
+          <w:p>
+            <w:r>
+              <w:t>Default</w:t>
+            </w:r>
+          </w:p>
+        </w:tc>
+        <w:tc>
+          <w:tcPr>
+            <w:tcW w:type="dxa" w:w="1805"/>
+          </w:tcPr>
+          <w:p>
+            <w:r>
+              <w:t>Storage</w:t>
+            </w:r>
+          </w:p>
+        </w:tc>
+        <w:tc>
+          <w:tcPr>
+            <w:tcW w:type="dxa" w:w="1805"/>
+          </w:tcPr>
+          <w:p>
+            <w:r>
+              <w:t>Effect</w:t>
+            </w:r>
+          </w:p>
+        </w:tc>
+      </w:tr>
+      <w:tr>
+        <w:tc>
+          <w:tcPr>
+            <w:tcW w:type="dxa" w:w="1805"/>
+          </w:tcPr>
+          <w:p>
+            <w:r>
+              <w:t>Z gain</w:t>
+            </w:r>
+          </w:p>
+        </w:tc>
+        <w:tc>
+          <w:tcPr>
+            <w:tcW w:type="dxa" w:w="1805"/>
+          </w:tcPr>
+          <w:p>
+            <w:r>
+              <w:t>g_movement_hysteresis_gain</w:t>
+            </w:r>
+          </w:p>
+        </w:tc>
+        <w:tc>
+          <w:tcPr>
+            <w:tcW w:type="dxa" w:w="1805"/>
+          </w:tcPr>
+          <w:p>
+            <w:r>
+              <w:t>4/75</w:t>
+            </w:r>
+          </w:p>
+        </w:tc>
+        <w:tc>
+          <w:tcPr>
+            <w:tcW w:type="dxa" w:w="1805"/>
+          </w:tcPr>
+          <w:p>
+            <w:r>
+              <w:t>storage.c v4</w:t>
+            </w:r>
+          </w:p>
+        </w:tc>
+        <w:tc>
+          <w:tcPr>
+            <w:tcW w:type="dxa" w:w="1805"/>
+          </w:tcPr>
+          <w:p>
+            <w:r>
+              <w:t>Linear correction for horizontal/Z travel.</w:t>
+            </w:r>
+          </w:p>
+        </w:tc>
+      </w:tr>
+      <w:tr>
+        <w:tc>
+          <w:tcPr>
+            <w:tcW w:type="dxa" w:w="1805"/>
+          </w:tcPr>
+          <w:p>
+            <w:r>
+              <w:t>Z offset</w:t>
+            </w:r>
+          </w:p>
+        </w:tc>
+        <w:tc>
+          <w:tcPr>
+            <w:tcW w:type="dxa" w:w="1805"/>
+          </w:tcPr>
+          <w:p>
+            <w:r>
+              <w:t>g_movement_hysteresis_offset_mm</w:t>
+            </w:r>
+          </w:p>
+        </w:tc>
+        <w:tc>
+          <w:tcPr>
+            <w:tcW w:type="dxa" w:w="1805"/>
+          </w:tcPr>
+          <w:p>
+            <w:r>
+              <w:t>0 mm</w:t>
+            </w:r>
+          </w:p>
+        </w:tc>
+        <w:tc>
+          <w:tcPr>
+            <w:tcW w:type="dxa" w:w="1805"/>
+          </w:tcPr>
+          <w:p>
+            <w:r>
+              <w:t>storage.c v4</w:t>
+            </w:r>
+          </w:p>
+        </w:tc>
+        <w:tc>
+          <w:tcPr>
+            <w:tcW w:type="dxa" w:w="1805"/>
+          </w:tcPr>
+          <w:p>
+            <w:r>
+              <w:t>Absolute Z motor-coordinate offset.</w:t>
+            </w:r>
+          </w:p>
+        </w:tc>
+      </w:tr>
+      <w:tr>
+        <w:tc>
+          <w:tcPr>
+            <w:tcW w:type="dxa" w:w="1805"/>
+          </w:tcPr>
+          <w:p>
+            <w:r>
+              <w:t>X gain</w:t>
+            </w:r>
+          </w:p>
+        </w:tc>
+        <w:tc>
+          <w:tcPr>
+            <w:tcW w:type="dxa" w:w="1805"/>
+          </w:tcPr>
+          <w:p>
+            <w:r>
+              <w:t>g_vertical_movement_hysteresis_gain</w:t>
+            </w:r>
+          </w:p>
+        </w:tc>
+        <w:tc>
+          <w:tcPr>
+            <w:tcW w:type="dxa" w:w="1805"/>
+          </w:tcPr>
+          <w:p>
+            <w:r>
+              <w:t>0</w:t>
+            </w:r>
+          </w:p>
+        </w:tc>
+        <w:tc>
+          <w:tcPr>
+            <w:tcW w:type="dxa" w:w="1805"/>
+          </w:tcPr>
+          <w:p>
+            <w:r>
+              <w:t>storage.c v4</w:t>
+            </w:r>
+          </w:p>
+        </w:tc>
+        <w:tc>
+          <w:tcPr>
+            <w:tcW w:type="dxa" w:w="1805"/>
+          </w:tcPr>
+          <w:p>
+            <w:r>
+              <w:t>Linear correction for vertical/X travel.</w:t>
+            </w:r>
+          </w:p>
+        </w:tc>
+      </w:tr>
+      <w:tr>
+        <w:tc>
+          <w:tcPr>
+            <w:tcW w:type="dxa" w:w="1805"/>
+          </w:tcPr>
+          <w:p>
+            <w:r>
+              <w:t>X offset</w:t>
+            </w:r>
+          </w:p>
+        </w:tc>
+        <w:tc>
+          <w:tcPr>
+            <w:tcW w:type="dxa" w:w="1805"/>
+          </w:tcPr>
+          <w:p>
+            <w:r>
+              <w:t>g_vertical_movement_hysteresis_offset_mm</w:t>
+            </w:r>
+          </w:p>
+        </w:tc>
+        <w:tc>
+          <w:tcPr>
+            <w:tcW w:type="dxa" w:w="1805"/>
+          </w:tcPr>
+          <w:p>
+            <w:r>
+              <w:t>0 mm</w:t>
+            </w:r>
+          </w:p>
+        </w:tc>
+        <w:tc>
+          <w:tcPr>
+            <w:tcW w:type="dxa" w:w="1805"/>
+          </w:tcPr>
+          <w:p>
+            <w:r>
+              <w:t>storage.c v4</w:t>
+            </w:r>
+          </w:p>
+        </w:tc>
+        <w:tc>
+          <w:tcPr>
+            <w:tcW w:type="dxa" w:w="1805"/>
+          </w:tcPr>
+          <w:p>
+            <w:r>
+              <w:t>Absolute X motor-coordinate offset.</w:t>
+            </w:r>
+          </w:p>
+        </w:tc>
+      </w:tr>
+      <w:tr>
+        <w:tc>
+          <w:tcPr>
+            <w:tcW w:type="dxa" w:w="1805"/>
+          </w:tcPr>
+          <w:p>
+            <w:r>
+              <w:t>X range</w:t>
+            </w:r>
+          </w:p>
+        </w:tc>
+        <w:tc>
+          <w:tcPr>
+            <w:tcW w:type="dxa" w:w="1805"/>
+          </w:tcPr>
+          <w:p>
+            <w:r>
+              <w:t>g_movement_max_x_mm</w:t>
+            </w:r>
+          </w:p>
+        </w:tc>
+        <w:tc>
+          <w:tcPr>
+            <w:tcW w:type="dxa" w:w="1805"/>
+          </w:tcPr>
+          <w:p>
+            <w:r>
+              <w:t>55 mm</w:t>
+            </w:r>
+          </w:p>
+        </w:tc>
+        <w:tc>
+          <w:tcPr>
+            <w:tcW w:type="dxa" w:w="1805"/>
+          </w:tcPr>
+          <w:p>
+            <w:r>
+              <w:t>storage.c v4</w:t>
+            </w:r>
+          </w:p>
+        </w:tc>
+        <w:tc>
+          <w:tcPr>
+            <w:tcW w:type="dxa" w:w="1805"/>
+          </w:tcPr>
+          <w:p>
+            <w:r>
+              <w:t>Maximum logical X target accepted by movement.</w:t>
+            </w:r>
+          </w:p>
+        </w:tc>
+      </w:tr>
+      <w:tr>
+        <w:tc>
+          <w:tcPr>
+            <w:tcW w:type="dxa" w:w="1805"/>
+          </w:tcPr>
+          <w:p>
+            <w:r>
+              <w:t>Z range</w:t>
+            </w:r>
+          </w:p>
+        </w:tc>
+        <w:tc>
+          <w:tcPr>
+            <w:tcW w:type="dxa" w:w="1805"/>
+          </w:tcPr>
+          <w:p>
+            <w:r>
+              <w:t>g_movement_max_z_mm</w:t>
+            </w:r>
+          </w:p>
+        </w:tc>
+        <w:tc>
+          <w:tcPr>
+            <w:tcW w:type="dxa" w:w="1805"/>
+          </w:tcPr>
+          <w:p>
+            <w:r>
+              <w:t>72 mm</w:t>
+            </w:r>
+          </w:p>
+        </w:tc>
+        <w:tc>
+          <w:tcPr>
+            <w:tcW w:type="dxa" w:w="1805"/>
+          </w:tcPr>
+          <w:p>
+            <w:r>
+              <w:t>storage.c v4</w:t>
+            </w:r>
+          </w:p>
+        </w:tc>
+        <w:tc>
+          <w:tcPr>
+            <w:tcW w:type="dxa" w:w="1805"/>
+          </w:tcPr>
+          <w:p>
+            <w:r>
+              <w:t>Maximum logical Z target accepted by movement.</w:t>
+            </w:r>
+          </w:p>
+        </w:tc>
+      </w:tr>
+      <w:tr>
+        <w:tc>
+          <w:tcPr>
+            <w:tcW w:type="dxa" w:w="1805"/>
+          </w:tcPr>
+          <w:p>
+            <w:r>
+              <w:t>Move speed</w:t>
+            </w:r>
+          </w:p>
+        </w:tc>
+        <w:tc>
+          <w:tcPr>
+            <w:tcW w:type="dxa" w:w="1805"/>
+          </w:tcPr>
+          <w:p>
+            <w:r>
+              <w:t>g_movement_speed_us</w:t>
+            </w:r>
+          </w:p>
+        </w:tc>
+        <w:tc>
+          <w:tcPr>
+            <w:tcW w:type="dxa" w:w="1805"/>
+          </w:tcPr>
+          <w:p>
+            <w:r>
+              <w:t>600 us</w:t>
+            </w:r>
+          </w:p>
+        </w:tc>
+        <w:tc>
+          <w:tcPr>
+            <w:tcW w:type="dxa" w:w="1805"/>
+          </w:tcPr>
+          <w:p>
+            <w:r>
+              <w:t>storage.c v4</w:t>
+            </w:r>
+          </w:p>
+        </w:tc>
+        <w:tc>
+          <w:tcPr>
+            <w:tcW w:type="dxa" w:w="1805"/>
+          </w:tcPr>
+          <w:p>
+            <w:r>
+              <w:t>STEP pulse delay during normal moves; lower value means faster movement.</w:t>
+            </w:r>
+          </w:p>
+        </w:tc>
+      </w:tr>
+      <w:tr>
+        <w:tc>
+          <w:tcPr>
+            <w:tcW w:type="dxa" w:w="1805"/>
+          </w:tcPr>
+          <w:p>
+            <w:r>
+              <w:t>Home speed</w:t>
+            </w:r>
+          </w:p>
+        </w:tc>
+        <w:tc>
+          <w:tcPr>
+            <w:tcW w:type="dxa" w:w="1805"/>
+          </w:tcPr>
+          <w:p>
+            <w:r>
+              <w:t>g_movement_home_speed_us</w:t>
+            </w:r>
+          </w:p>
+        </w:tc>
+        <w:tc>
+          <w:tcPr>
+            <w:tcW w:type="dxa" w:w="1805"/>
+          </w:tcPr>
+          <w:p>
+            <w:r>
+              <w:t>1000 us</w:t>
+            </w:r>
+          </w:p>
+        </w:tc>
+        <w:tc>
+          <w:tcPr>
+            <w:tcW w:type="dxa" w:w="1805"/>
+          </w:tcPr>
+          <w:p>
+            <w:r>
+              <w:t>storage.c v4</w:t>
+            </w:r>
+          </w:p>
+        </w:tc>
+        <w:tc>
+          <w:tcPr>
+            <w:tcW w:type="dxa" w:w="1805"/>
+          </w:tcPr>
+          <w:p>
+            <w:r>
+              <w:t>STEP pulse delay during first-touch homing and backoff.</w:t>
+            </w:r>
+          </w:p>
+        </w:tc>
+      </w:tr>
+    </w:tbl>
+    <w:p>
+      <w:pPr/>
+      <w:r>
+        <w:t>Storage and input integration</w:t>
+      </w:r>
+    </w:p>
+    <w:p>
+      <w:pPr>
+        <w:pStyle w:val="Prrafodelista"/>
+      </w:pPr>
+      <w:r>
+        <w:t>Core/Src/storage.c persists these values in storage record version 4. Older v1/v2/v3 records are migrated by preserving known fields and loading defaults for new movement parameters.</w:t>
+      </w:r>
+    </w:p>
+    <w:p>
+      <w:pPr>
+        <w:pStyle w:val="Prrafodelista"/>
+      </w:pPr>
+      <w:r>
+        <w:t>In the WiFi build, Appli/App/httpserver.c updates the values from the Movement parameters web block and then calls saveMovementConfig().</w:t>
+      </w:r>
+    </w:p>
+    <w:p>
+      <w:pPr>
+        <w:pStyle w:val="Prrafodelista"/>
+      </w:pPr>
+      <w:r>
+        <w:t>In STM32_migration, non-WiFi inputs can call MovementParameters_Set...() functions and then saveMovementConfig() to make the change survive reset.</w:t>
+      </w:r>
+    </w:p>
+    <w:p>
+      <w:pPr>
+        <w:pStyle w:val="Prrafodelista"/>
+      </w:pPr>
+      <w:r>
+        <w:t>Core/Src/movement.cpp uses the configured range, gain and offset for target compensation and computes the first-touch homing step limit from range, gain, abs(offset), and the 30 mm safety margin.</w:t>
+      </w:r>
+    </w:p>
+    <w:p>
+      <w:pPr>
+        <w:pStyle w:val="Prrafodelista"/>
+      </w:pPr>
+      <w:r>
+        <w:t>Core/Src/autoMode.cpp validates calculated solar targets against the configured X/Z range and parks at the clamped 10 mm, 10 mm safe position outside valid sunlight or movement limits.</w:t>
       </w:r>
     </w:p>
     <w:p>

</xml_diff>